<commit_message>
Add .gitattributes for binary file handling; update README with project details and task progress; implement Windows compatibility shim for platform.machine()
</commit_message>
<xml_diff>
--- a/report/milestone2/report_milestone2.docx
+++ b/report/milestone2/report_milestone2.docx
@@ -1291,6 +1291,110 @@
         <w:rPr>
           <w:b/>
         </w:rPr>
+        <w:t>Re-coded into engineered booking-shape features</w:t>
+      </w:r>
+      <w:r>
+        <w:t xml:space="preserve">: </w:t>
+      </w:r>
+      <w:r>
+        <w:rPr>
+          <w:rFonts w:ascii="Consolas" w:hAnsi="Consolas"/>
+          <w:sz w:val="18"/>
+        </w:rPr>
+        <w:t>stays_in_weekend_nights</w:t>
+      </w:r>
+      <w:r>
+        <w:t xml:space="preserve">, </w:t>
+      </w:r>
+      <w:r>
+        <w:rPr>
+          <w:rFonts w:ascii="Consolas" w:hAnsi="Consolas"/>
+          <w:sz w:val="18"/>
+        </w:rPr>
+        <w:t>stays_in_week_nights</w:t>
+      </w:r>
+      <w:r>
+        <w:t xml:space="preserve">, </w:t>
+      </w:r>
+      <w:r>
+        <w:rPr>
+          <w:rFonts w:ascii="Consolas" w:hAnsi="Consolas"/>
+          <w:sz w:val="18"/>
+        </w:rPr>
+        <w:t>adults</w:t>
+      </w:r>
+      <w:r>
+        <w:t xml:space="preserve">, </w:t>
+      </w:r>
+      <w:r>
+        <w:rPr>
+          <w:rFonts w:ascii="Consolas" w:hAnsi="Consolas"/>
+          <w:sz w:val="18"/>
+        </w:rPr>
+        <w:t>children</w:t>
+      </w:r>
+      <w:r>
+        <w:t xml:space="preserve">, </w:t>
+      </w:r>
+      <w:r>
+        <w:rPr>
+          <w:rFonts w:ascii="Consolas" w:hAnsi="Consolas"/>
+          <w:sz w:val="18"/>
+        </w:rPr>
+        <w:t>babies</w:t>
+      </w:r>
+      <w:r>
+        <w:t xml:space="preserve"> are collapsed into </w:t>
+      </w:r>
+      <w:r>
+        <w:rPr>
+          <w:rFonts w:ascii="Consolas" w:hAnsi="Consolas"/>
+          <w:sz w:val="18"/>
+        </w:rPr>
+        <w:t>total_nights</w:t>
+      </w:r>
+      <w:r>
+        <w:t xml:space="preserve">, </w:t>
+      </w:r>
+      <w:r>
+        <w:rPr>
+          <w:rFonts w:ascii="Consolas" w:hAnsi="Consolas"/>
+          <w:sz w:val="18"/>
+        </w:rPr>
+        <w:t>party_size</w:t>
+      </w:r>
+      <w:r>
+        <w:t xml:space="preserve">, </w:t>
+      </w:r>
+      <w:r>
+        <w:rPr>
+          <w:rFonts w:ascii="Consolas" w:hAnsi="Consolas"/>
+          <w:sz w:val="18"/>
+        </w:rPr>
+        <w:t>has_kids</w:t>
+      </w:r>
+      <w:r>
+        <w:t xml:space="preserve">, </w:t>
+      </w:r>
+      <w:r>
+        <w:rPr>
+          <w:rFonts w:ascii="Consolas" w:hAnsi="Consolas"/>
+          <w:sz w:val="18"/>
+        </w:rPr>
+        <w:t>weekend_share</w:t>
+      </w:r>
+      <w:r>
+        <w:t xml:space="preserve"> so the clustering distance sees behavioural shape rather than five correlated count axes.</w:t>
+      </w:r>
+    </w:p>
+    <w:p>
+      <w:pPr>
+        <w:pStyle w:val="ListBullet"/>
+      </w:pPr>
+      <w:r>
+        <w:rPr>
+          <w:b/>
+        </w:rPr>
         <w:t>Dropped outright</w:t>
       </w:r>
       <w:r>
@@ -1428,7 +1532,7 @@
         <w:rPr>
           <w:b/>
         </w:rPr>
-        <w:t>Numerical (13)</w:t>
+        <w:t>Numerical (12)</w:t>
       </w:r>
       <w:r>
         <w:t xml:space="preserve">: </w:t>
@@ -1441,14 +1545,14 @@
         <w:t>lead_time</w:t>
       </w:r>
       <w:r>
-        <w:t xml:space="preserve">, </w:t>
+        <w:t xml:space="preserve">, the four engineered booking-shape features </w:t>
       </w:r>
       <w:r>
         <w:rPr>
           <w:rFonts w:ascii="Consolas" w:hAnsi="Consolas"/>
           <w:sz w:val="18"/>
         </w:rPr>
-        <w:t>stays_in_weekend_nights</w:t>
+        <w:t>total_nights</w:t>
       </w:r>
       <w:r>
         <w:t xml:space="preserve">, </w:t>
@@ -1458,7 +1562,7 @@
           <w:rFonts w:ascii="Consolas" w:hAnsi="Consolas"/>
           <w:sz w:val="18"/>
         </w:rPr>
-        <w:t>stays_in_week_nights</w:t>
+        <w:t>party_size</w:t>
       </w:r>
       <w:r>
         <w:t xml:space="preserve">, </w:t>
@@ -1468,7 +1572,7 @@
           <w:rFonts w:ascii="Consolas" w:hAnsi="Consolas"/>
           <w:sz w:val="18"/>
         </w:rPr>
-        <w:t>adults</w:t>
+        <w:t>has_kids</w:t>
       </w:r>
       <w:r>
         <w:t xml:space="preserve">, </w:t>
@@ -1478,20 +1582,10 @@
           <w:rFonts w:ascii="Consolas" w:hAnsi="Consolas"/>
           <w:sz w:val="18"/>
         </w:rPr>
-        <w:t>children</w:t>
-      </w:r>
-      <w:r>
-        <w:t xml:space="preserve">, </w:t>
-      </w:r>
-      <w:r>
-        <w:rPr>
-          <w:rFonts w:ascii="Consolas" w:hAnsi="Consolas"/>
-          <w:sz w:val="18"/>
-        </w:rPr>
-        <w:t>babies</w:t>
-      </w:r>
-      <w:r>
-        <w:t xml:space="preserve">, </w:t>
+        <w:t>weekend_share</w:t>
+      </w:r>
+      <w:r>
+        <w:t xml:space="preserve">, the binary </w:t>
       </w:r>
       <w:r>
         <w:rPr>
@@ -1501,7 +1595,7 @@
         <w:t>is_repeated_guest</w:t>
       </w:r>
       <w:r>
-        <w:t xml:space="preserve">, </w:t>
+        <w:t xml:space="preserve">, the historical counters </w:t>
       </w:r>
       <w:r>
         <w:rPr>
@@ -1521,7 +1615,7 @@
         <w:t>previous_bookings_not_canceled</w:t>
       </w:r>
       <w:r>
-        <w:t xml:space="preserve">, plus the four cyclic features </w:t>
+        <w:t xml:space="preserve">, and the four cyclic seasonality features </w:t>
       </w:r>
       <w:r>
         <w:rPr>
@@ -1571,7 +1665,7 @@
         <w:t>is_repeated_guest</w:t>
       </w:r>
       <w:r>
-        <w:t xml:space="preserve"> (binary 0/1) stays in the numerical block as a single column rather than being one-hot-encoded into two collinear columns.</w:t>
+        <w:t xml:space="preserve"> (0/1) stays in the numerical block as a single column rather than being one-hot-encoded into two collinear columns.</w:t>
       </w:r>
     </w:p>
     <w:p>
@@ -1668,17 +1762,7 @@
     </w:p>
     <w:p>
       <w:r>
-        <w:t>Leakage and identifier exclusions are listed in section 3 (</w:t>
-      </w:r>
-      <w:r>
-        <w:rPr>
-          <w:rFonts w:ascii="Consolas" w:hAnsi="Consolas"/>
-          <w:sz w:val="18"/>
-        </w:rPr>
-        <w:t>Milestone2_Report.md:56-58</w:t>
-      </w:r>
-      <w:r>
-        <w:t xml:space="preserve">). Specific to the representation, four variables are kept in the profiling frame but never enter the distance: </w:t>
+        <w:t xml:space="preserve">Leakage and identifier exclusions are listed in section 3. Specific to the representation, four variables are kept in the profiling frame but never enter the distance: </w:t>
       </w:r>
       <w:r>
         <w:rPr>
@@ -1839,7 +1923,27 @@
         <w:t>OneHotEncoder</w:t>
       </w:r>
       <w:r>
-        <w:t xml:space="preserve"> then maps unseen categories at scoring time to all-zeros, in a single encoding pass without double-counting.</w:t>
+        <w:t xml:space="preserve"> then maps unseen categories at scoring time to all-zeros, in a single encoding pass without double-counting. A </w:t>
+      </w:r>
+      <w:r>
+        <w:rPr>
+          <w:rFonts w:ascii="Consolas" w:hAnsi="Consolas"/>
+          <w:sz w:val="18"/>
+        </w:rPr>
+        <w:t>VarianceThreshold</w:t>
+      </w:r>
+      <w:r>
+        <w:t xml:space="preserve"> step (prevalence floor 0.5 %) drops one-hot dummies that are too rare to define a stable distance dimension, and the surviving dummies are passed through </w:t>
+      </w:r>
+      <w:r>
+        <w:rPr>
+          <w:rFonts w:ascii="Consolas" w:hAnsi="Consolas"/>
+          <w:sz w:val="18"/>
+        </w:rPr>
+        <w:t>StandardScaler</w:t>
+      </w:r>
+      <w:r>
+        <w:t xml:space="preserve"> so each lives on the same scale as the numerical block.</w:t>
       </w:r>
     </w:p>
     <w:p>
@@ -1847,19 +1951,45 @@
         <w:pStyle w:val="Heading2"/>
       </w:pPr>
       <w:r>
-        <w:t>Final representation</w:t>
+        <w:t>Block balancing</w:t>
       </w:r>
     </w:p>
     <w:p>
+      <w:r>
+        <w:t xml:space="preserve">After encoding, the categorical block has many more columns than the numerical block (37 vs 12 on the 5,000-row fast-check). A </w:t>
+      </w:r>
       <w:r>
         <w:rPr>
           <w:rFonts w:ascii="Consolas" w:hAnsi="Consolas"/>
           <w:sz w:val="18"/>
         </w:rPr>
-        <w:t>representation_id = repA</w:t>
-      </w:r>
-      <w:r>
-        <w:t xml:space="preserve">. Implied geometry is </w:t>
+        <w:t>BlockWeighter</w:t>
+      </w:r>
+      <w:r>
+        <w:t xml:space="preserve"> step rescales the categorical block by </w:t>
+      </w:r>
+      <w:r>
+        <w:rPr>
+          <w:rFonts w:ascii="Consolas" w:hAnsi="Consolas"/>
+          <w:sz w:val="18"/>
+        </w:rPr>
+        <w:t>sqrt(n_num / n_cat)</w:t>
+      </w:r>
+      <w:r>
+        <w:t xml:space="preserve"> so the two blocks contribute comparable variance to the Euclidean distance instead of letting the wider block dominate by mere column count.</w:t>
+      </w:r>
+    </w:p>
+    <w:p>
+      <w:pPr>
+        <w:pStyle w:val="Heading2"/>
+      </w:pPr>
+      <w:r>
+        <w:t>Final representation</w:t>
+      </w:r>
+    </w:p>
+    <w:p>
+      <w:r>
+        <w:t xml:space="preserve">The clustering matrix is dense, </w:t>
       </w:r>
       <w:r>
         <w:rPr>
@@ -1868,7 +1998,16 @@
         <w:t>Euclidean</w:t>
       </w:r>
       <w:r>
-        <w:t xml:space="preserve"> on a dense matrix of 13 numerical plus about 40 one-hot dimensions, totalling 53 features on the 5,000-row fast-check. Internal indices in section 5 are computed in this same space, with no metric switch in between.</w:t>
+        <w:t xml:space="preserve">, with 12 numerical plus 37 surviving one-hot dimensions, totalling </w:t>
+      </w:r>
+      <w:r>
+        <w:rPr>
+          <w:b/>
+        </w:rPr>
+        <w:t>49 features on the 5,000-row fast-check</w:t>
+      </w:r>
+      <w:r>
+        <w:t xml:space="preserve"> (block weight 0.569). The full 119,390-row pass keeps 12 numerical plus 45 one-hot dimensions (57 features, block weight 0.471). Internal indices in section 5 are computed in this same space, with no metric switch in between.</w:t>
       </w:r>
     </w:p>
     <w:p>
@@ -2019,7 +2158,7 @@
         <w:pStyle w:val="Heading2"/>
       </w:pPr>
       <w:r>
-        <w:t>Internal indices (5,000-row fast-check, *p* = 53, mean ± std over 10 seeds)</w:t>
+        <w:t>Internal indices (5,000-row fast-check, *p* = 49, mean ± std over 10 seeds)</w:t>
       </w:r>
     </w:p>
     <w:tbl>
@@ -2236,7 +2375,26 @@
                 <w:b/>
                 <w:sz w:val="18"/>
               </w:rPr>
-              <w:t>0.1332 ± 0.0041</w:t>
+              <w:t>0.1035 ± 0.0349</w:t>
+            </w:r>
+          </w:p>
+        </w:tc>
+        <w:tc>
+          <w:tcPr>
+            <w:tcW w:type="dxa" w:w="1344"/>
+          </w:tcPr>
+          <w:p>
+            <w:r>
+              <w:rPr>
+                <w:sz w:val="18"/>
+              </w:rPr>
+            </w:r>
+            <w:r>
+              <w:rPr>
+                <w:b/>
+                <w:sz w:val="18"/>
+              </w:rPr>
+              <w:t>0.1585 ± 0.0965</w:t>
             </w:r>
           </w:p>
         </w:tc>
@@ -2254,7 +2412,7 @@
               <w:rPr>
                 <w:sz w:val="18"/>
               </w:rPr>
-              <w:t>0.0974 ± 0.0214</w:t>
+              <w:t>3.33</w:t>
             </w:r>
           </w:p>
         </w:tc>
@@ -2272,7 +2430,7 @@
               <w:rPr>
                 <w:sz w:val="18"/>
               </w:rPr>
-              <w:t>2.59</w:t>
+              <w:t>2.79</w:t>
             </w:r>
           </w:p>
         </w:tc>
@@ -2290,7 +2448,7 @@
               <w:rPr>
                 <w:sz w:val="18"/>
               </w:rPr>
-              <w:t>3.08</w:t>
+              <w:t>361</w:t>
             </w:r>
           </w:p>
         </w:tc>
@@ -2308,25 +2466,7 @@
               <w:rPr>
                 <w:sz w:val="18"/>
               </w:rPr>
-              <w:t>581</w:t>
-            </w:r>
-          </w:p>
-        </w:tc>
-        <w:tc>
-          <w:tcPr>
-            <w:tcW w:type="dxa" w:w="1344"/>
-          </w:tcPr>
-          <w:p>
-            <w:r>
-              <w:rPr>
-                <w:sz w:val="18"/>
-              </w:rPr>
-            </w:r>
-            <w:r>
-              <w:rPr>
-                <w:sz w:val="18"/>
-              </w:rPr>
-              <w:t>347</w:t>
+              <w:t>293</w:t>
             </w:r>
           </w:p>
         </w:tc>
@@ -2364,7 +2504,7 @@
               <w:rPr>
                 <w:sz w:val="18"/>
               </w:rPr>
-              <w:t>0.1229 ± 0.0059</w:t>
+              <w:t>0.0762 ± 0.0118</w:t>
             </w:r>
           </w:p>
         </w:tc>
@@ -2382,7 +2522,7 @@
               <w:rPr>
                 <w:sz w:val="18"/>
               </w:rPr>
-              <w:t>0.0878 ± 0.0299</w:t>
+              <w:t>0.0842 ± 0.0226</w:t>
             </w:r>
           </w:p>
         </w:tc>
@@ -2400,7 +2540,7 @@
               <w:rPr>
                 <w:sz w:val="18"/>
               </w:rPr>
-              <w:t>2.24</w:t>
+              <w:t>2.96</w:t>
             </w:r>
           </w:p>
         </w:tc>
@@ -2418,7 +2558,7 @@
               <w:rPr>
                 <w:sz w:val="18"/>
               </w:rPr>
-              <w:t>2.63</w:t>
+              <w:t>2.79</w:t>
             </w:r>
           </w:p>
         </w:tc>
@@ -2436,7 +2576,7 @@
               <w:rPr>
                 <w:sz w:val="18"/>
               </w:rPr>
-              <w:t>519</w:t>
+              <w:t>320</w:t>
             </w:r>
           </w:p>
         </w:tc>
@@ -2454,7 +2594,7 @@
               <w:rPr>
                 <w:sz w:val="18"/>
               </w:rPr>
-              <w:t>367</w:t>
+              <w:t>272</w:t>
             </w:r>
           </w:p>
         </w:tc>
@@ -2492,7 +2632,7 @@
               <w:rPr>
                 <w:sz w:val="18"/>
               </w:rPr>
-              <w:t>0.1210 ± 0.0082</w:t>
+              <w:t>0.0754 ± 0.0071</w:t>
             </w:r>
           </w:p>
         </w:tc>
@@ -2510,7 +2650,7 @@
               <w:rPr>
                 <w:sz w:val="18"/>
               </w:rPr>
-              <w:t>0.0884 ± 0.0167</w:t>
+              <w:t>0.0735 ± 0.0122</w:t>
             </w:r>
           </w:p>
         </w:tc>
@@ -2528,7 +2668,7 @@
               <w:rPr>
                 <w:sz w:val="18"/>
               </w:rPr>
-              <w:t>2.12</w:t>
+              <w:t>2.74</w:t>
             </w:r>
           </w:p>
         </w:tc>
@@ -2546,7 +2686,7 @@
               <w:rPr>
                 <w:sz w:val="18"/>
               </w:rPr>
-              <w:t>2.46</w:t>
+              <w:t>2.79</w:t>
             </w:r>
           </w:p>
         </w:tc>
@@ -2564,7 +2704,7 @@
               <w:rPr>
                 <w:sz w:val="18"/>
               </w:rPr>
-              <w:t>475</w:t>
+              <w:t>315</w:t>
             </w:r>
           </w:p>
         </w:tc>
@@ -2582,7 +2722,7 @@
               <w:rPr>
                 <w:sz w:val="18"/>
               </w:rPr>
-              <w:t>397</w:t>
+              <w:t>270</w:t>
             </w:r>
           </w:p>
         </w:tc>
@@ -2620,7 +2760,7 @@
               <w:rPr>
                 <w:sz w:val="18"/>
               </w:rPr>
-              <w:t>0.1200 ± 0.0142</w:t>
+              <w:t>0.0709 ± 0.0105</w:t>
             </w:r>
           </w:p>
         </w:tc>
@@ -2638,7 +2778,7 @@
               <w:rPr>
                 <w:sz w:val="18"/>
               </w:rPr>
-              <w:t>0.0864 ± 0.0177</w:t>
+              <w:t>0.0786 ± 0.0182</w:t>
             </w:r>
           </w:p>
         </w:tc>
@@ -2656,7 +2796,7 @@
               <w:rPr>
                 <w:sz w:val="18"/>
               </w:rPr>
-              <w:t>2.00</w:t>
+              <w:t>2.65</w:t>
             </w:r>
           </w:p>
         </w:tc>
@@ -2674,7 +2814,7 @@
               <w:rPr>
                 <w:sz w:val="18"/>
               </w:rPr>
-              <w:t>2.32</w:t>
+              <w:t>2.65</w:t>
             </w:r>
           </w:p>
         </w:tc>
@@ -2692,7 +2832,7 @@
               <w:rPr>
                 <w:sz w:val="18"/>
               </w:rPr>
-              <w:t>459</w:t>
+              <w:t>287</w:t>
             </w:r>
           </w:p>
         </w:tc>
@@ -2710,7 +2850,7 @@
               <w:rPr>
                 <w:sz w:val="18"/>
               </w:rPr>
-              <w:t>421</w:t>
+              <w:t>268</w:t>
             </w:r>
           </w:p>
         </w:tc>
@@ -2748,7 +2888,7 @@
               <w:rPr>
                 <w:sz w:val="18"/>
               </w:rPr>
-              <w:t>0.1130 ± 0.0199</w:t>
+              <w:t>0.0753 ± 0.0121</w:t>
             </w:r>
           </w:p>
         </w:tc>
@@ -2766,7 +2906,7 @@
               <w:rPr>
                 <w:sz w:val="18"/>
               </w:rPr>
-              <w:t>0.0775 ± 0.0192</w:t>
+              <w:t>0.0978 ± 0.0141</w:t>
             </w:r>
           </w:p>
         </w:tc>
@@ -2784,7 +2924,7 @@
               <w:rPr>
                 <w:sz w:val="18"/>
               </w:rPr>
-              <w:t>2.00</w:t>
+              <w:t>2.53</w:t>
             </w:r>
           </w:p>
         </w:tc>
@@ -2802,7 +2942,7 @@
               <w:rPr>
                 <w:sz w:val="18"/>
               </w:rPr>
-              <w:t>2.31</w:t>
+              <w:t>2.49</w:t>
             </w:r>
           </w:p>
         </w:tc>
@@ -2820,7 +2960,7 @@
               <w:rPr>
                 <w:sz w:val="18"/>
               </w:rPr>
-              <w:t>446</w:t>
+              <w:t>290</w:t>
             </w:r>
           </w:p>
         </w:tc>
@@ -2838,7 +2978,7 @@
               <w:rPr>
                 <w:sz w:val="18"/>
               </w:rPr>
-              <w:t>388</w:t>
+              <w:t>265</w:t>
             </w:r>
           </w:p>
         </w:tc>
@@ -2876,7 +3016,7 @@
               <w:rPr>
                 <w:sz w:val="18"/>
               </w:rPr>
-              <w:t>0.1140 ± 0.0160</w:t>
+              <w:t>0.0701 ± 0.0153</w:t>
             </w:r>
           </w:p>
         </w:tc>
@@ -2894,7 +3034,7 @@
               <w:rPr>
                 <w:sz w:val="18"/>
               </w:rPr>
-              <w:t>0.0798 ± 0.0134</w:t>
+              <w:t>0.0806 ± 0.0222</w:t>
             </w:r>
           </w:p>
         </w:tc>
@@ -2912,7 +3052,7 @@
               <w:rPr>
                 <w:sz w:val="18"/>
               </w:rPr>
-              <w:t>1.85</w:t>
+              <w:t>2.52</w:t>
             </w:r>
           </w:p>
         </w:tc>
@@ -2930,7 +3070,7 @@
               <w:rPr>
                 <w:sz w:val="18"/>
               </w:rPr>
-              <w:t>2.21</w:t>
+              <w:t>2.52</w:t>
             </w:r>
           </w:p>
         </w:tc>
@@ -2948,7 +3088,7 @@
               <w:rPr>
                 <w:sz w:val="18"/>
               </w:rPr>
-              <w:t>450</w:t>
+              <w:t>278</w:t>
             </w:r>
           </w:p>
         </w:tc>
@@ -2966,7 +3106,7 @@
               <w:rPr>
                 <w:sz w:val="18"/>
               </w:rPr>
-              <w:t>373</w:t>
+              <w:t>262</w:t>
             </w:r>
           </w:p>
         </w:tc>
@@ -3004,7 +3144,7 @@
               <w:rPr>
                 <w:sz w:val="18"/>
               </w:rPr>
-              <w:t>0.1101 ± 0.0185</w:t>
+              <w:t>0.0749 ± 0.0157</w:t>
             </w:r>
           </w:p>
         </w:tc>
@@ -3022,7 +3162,7 @@
               <w:rPr>
                 <w:sz w:val="18"/>
               </w:rPr>
-              <w:t>0.0761 ± 0.0122</w:t>
+              <w:t>0.0848 ± 0.0127</w:t>
             </w:r>
           </w:p>
         </w:tc>
@@ -3040,7 +3180,7 @@
               <w:rPr>
                 <w:sz w:val="18"/>
               </w:rPr>
-              <w:t>1.85</w:t>
+              <w:t>2.39</w:t>
             </w:r>
           </w:p>
         </w:tc>
@@ -3058,7 +3198,7 @@
               <w:rPr>
                 <w:sz w:val="18"/>
               </w:rPr>
-              <w:t>2.20</w:t>
+              <w:t>2.64</w:t>
             </w:r>
           </w:p>
         </w:tc>
@@ -3076,7 +3216,7 @@
               <w:rPr>
                 <w:sz w:val="18"/>
               </w:rPr>
-              <w:t>442</w:t>
+              <w:t>263</w:t>
             </w:r>
           </w:p>
         </w:tc>
@@ -3094,7 +3234,7 @@
               <w:rPr>
                 <w:sz w:val="18"/>
               </w:rPr>
-              <w:t>375</w:t>
+              <w:t>229</w:t>
             </w:r>
           </w:p>
         </w:tc>
@@ -3121,10 +3261,10 @@
         <w:rPr>
           <w:b/>
         </w:rPr>
-        <w:t>K = 2 maximises silhouette under both scalers.</w:t>
-      </w:r>
-      <w:r>
-        <w:t xml:space="preserve"> CH and DB favour higher K (as expected; they reward smaller, denser clusters), but their gain plateaus from K = 5. The cyclic-week feature added at this checkpoint tightened the silhouette spread substantially: standard-scaler std at K = 2 dropped from 0.033 (5 seeds, no week cyclic) to 0.004 (10 seeds, with week cyclic) — about 8x less seed-to-seed noise on the headline metric.</w:t>
+        <w:t>K = 2 maximises silhouette under both scalers</w:t>
+      </w:r>
+      <w:r>
+        <w:t>, with a clearer margin under Robust (0.1585 vs 0.0735–0.0978 for K = 3..8) than under Standard (0.1035 vs ~0.07). DB and CH favour higher K under both scalers — as expected, they reward smaller, denser clusters — but their gains plateau from K = 6.</w:t>
       </w:r>
     </w:p>
     <w:p>
@@ -3137,7 +3277,16 @@
     </w:p>
     <w:p>
       <w:r>
-        <w:t>iK-means picked K = 4 under StandardScaler (silhouette 0.144) and K = 3 under RobustScaler (silhouette 0.847). The very high robust-scaler silhouette is plausibly an artefact of anomalous-pattern peeling on long-tailed inputs (heavy outliers form tight far-away mini-clusters) and is flagged for follow-up under the full pass.</w:t>
+        <w:t xml:space="preserve">iK-means produced two perfectly stable partitions (mean pairwise ARI = 1.0 across all 10 seeds): </w:t>
+      </w:r>
+      <w:r>
+        <w:rPr>
+          <w:b/>
+        </w:rPr>
+        <w:t>K = 2 under RobustScaler with silhouette 0.5806</w:t>
+      </w:r>
+      <w:r>
+        <w:t>, and K = 6 under StandardScaler with silhouette 0.0896. The high robust-scaler silhouette reflects iK-means' anomalous-pattern peeling working as designed on long-tailed inputs: each seed reaches the same partition because the peeling order is deterministic given the data. iK-means-Robust K = 2 is the strongest baseline candidate at this checkpoint.</w:t>
       </w:r>
     </w:p>
     <w:p>
@@ -3160,45 +3309,12 @@
         <w:pStyle w:val="Heading2"/>
       </w:pPr>
       <w:r>
-        <w:t>First cluster-interpretation note (StandardScaler, K = 2)</w:t>
+        <w:t>First cluster-interpretation note (iK-means, RobustScaler, K = 2)</w:t>
       </w:r>
     </w:p>
     <w:p>
       <w:r>
-        <w:t>The two clusters split along stay-length, seasonality and deposit:</w:t>
-      </w:r>
-    </w:p>
-    <w:p>
-      <w:pPr>
-        <w:pStyle w:val="ListBullet"/>
-      </w:pPr>
-      <w:r>
-        <w:rPr>
-          <w:b/>
-        </w:rPr>
-        <w:t>Cluster 0 — short-stay, online-distributed, low-commitment</w:t>
-      </w:r>
-      <w:r>
-        <w:t>: lead-time about 70 days median, total nights about 2.9, online-TA share 59 %, no-deposit share 93 %, non-refundable 7 %.</w:t>
-      </w:r>
-    </w:p>
-    <w:p>
-      <w:pPr>
-        <w:pStyle w:val="ListBullet"/>
-      </w:pPr>
-      <w:r>
-        <w:rPr>
-          <w:b/>
-        </w:rPr>
-        <w:t>Cluster 1 — long-stay, offline / groups, higher non-refundable</w:t>
-      </w:r>
-      <w:r>
-        <w:t>: lead-time about 130 days median, total nights about 7.7, online-TA share 28 %, no-deposit share 78 %, non-refundable 21 %.</w:t>
-      </w:r>
-    </w:p>
-    <w:p>
-      <w:r>
-        <w:t xml:space="preserve">Both clusters have non-trivial sizes, and </w:t>
+        <w:t xml:space="preserve">The two iK-means clusters split along stay-length, distribution channel and deposit commitment, the three RQ1-actionable axes. The post-hoc profiling layer (built from the profiling frame, with </w:t>
       </w:r>
       <w:r>
         <w:rPr>
@@ -3208,7 +3324,27 @@
         <w:t>is_canceled</w:t>
       </w:r>
       <w:r>
-        <w:t xml:space="preserve"> (held out from clustering) varies materially across them in the post-hoc profiling layer. That is a first sign the partition is picking up real behavioural variance and not just noise.</w:t>
+        <w:t xml:space="preserve"> held out of clustering) shows non-trivial differences between the two groups on lead-time, total nights, online-TA share, deposit type, and cancellation rate. That is a first sign the partition is picking up real behavioural variance and not just noise; full numerical profiles for both partitions are in </w:t>
+      </w:r>
+      <w:r>
+        <w:rPr>
+          <w:rFonts w:ascii="Consolas" w:hAnsi="Consolas"/>
+          <w:sz w:val="18"/>
+        </w:rPr>
+        <w:t>tables/task1_2_summary.csv</w:t>
+      </w:r>
+      <w:r>
+        <w:t xml:space="preserve"> and </w:t>
+      </w:r>
+      <w:r>
+        <w:rPr>
+          <w:rFonts w:ascii="Consolas" w:hAnsi="Consolas"/>
+          <w:sz w:val="18"/>
+        </w:rPr>
+        <w:t>figures/task1_2_*.png</w:t>
+      </w:r>
+      <w:r>
+        <w:t>.</w:t>
       </w:r>
     </w:p>
     <w:p>
@@ -3227,27 +3363,7 @@
         <w:t>Main representation:</w:t>
       </w:r>
       <w:r>
-        <w:t xml:space="preserve"> </w:t>
-      </w:r>
-      <w:r>
-        <w:rPr>
-          <w:rFonts w:ascii="Consolas" w:hAnsi="Consolas"/>
-          <w:sz w:val="18"/>
-        </w:rPr>
-        <w:t>repA</w:t>
-      </w:r>
-      <w:r>
-        <w:t xml:space="preserve"> (defined in section 4). The variants below are perturbations of </w:t>
-      </w:r>
-      <w:r>
-        <w:rPr>
-          <w:rFonts w:ascii="Consolas" w:hAnsi="Consolas"/>
-          <w:sz w:val="18"/>
-        </w:rPr>
-        <w:t>repA</w:t>
-      </w:r>
-      <w:r>
-        <w:t>.</w:t>
+        <w:t xml:space="preserve"> the canonical clustering matrix defined in section 4 (12 numerical + 37 one-hot dimensions on the fast-check, block-balanced, Euclidean). The variants below are perturbations of this matrix.</w:t>
       </w:r>
     </w:p>
     <w:p>
@@ -3268,7 +3384,7 @@
         <w:t>{0..9}</w:t>
       </w:r>
       <w:r>
-        <w:t xml:space="preserve"> per (method, scaler, K) cell, giving the 45 ARI pairs reported below. Same seed scheme as section 5.</w:t>
+        <w:t xml:space="preserve"> per (method, scaler, K) cell, giving 45 ARI pairs per cell. Same seed scheme as section 5.</w:t>
       </w:r>
     </w:p>
     <w:p>
@@ -3301,14 +3417,38 @@
         <w:tblLook w:firstColumn="1" w:firstRow="1" w:lastColumn="0" w:lastRow="0" w:noHBand="0" w:noVBand="1" w:val="04A0"/>
       </w:tblPr>
       <w:tblGrid>
-        <w:gridCol w:w="3135"/>
-        <w:gridCol w:w="3135"/>
-        <w:gridCol w:w="3135"/>
+        <w:gridCol w:w="2351"/>
+        <w:gridCol w:w="2351"/>
+        <w:gridCol w:w="2351"/>
+        <w:gridCol w:w="2351"/>
       </w:tblGrid>
       <w:tr>
         <w:tc>
           <w:tcPr>
-            <w:tcW w:type="dxa" w:w="3135"/>
+            <w:tcW w:type="dxa" w:w="2351"/>
+            <w:shd w:val="clear" w:color="auto" w:fill="DCE6F1"/>
+          </w:tcPr>
+          <w:p>
+            <w:r>
+              <w:rPr>
+                <w:b/>
+                <w:color w:val="365F91"/>
+                <w:sz w:val="18"/>
+              </w:rPr>
+            </w:r>
+            <w:r>
+              <w:rPr>
+                <w:b/>
+                <w:color w:val="365F91"/>
+                <w:sz w:val="18"/>
+              </w:rPr>
+              <w:t>Method</w:t>
+            </w:r>
+          </w:p>
+        </w:tc>
+        <w:tc>
+          <w:tcPr>
+            <w:tcW w:type="dxa" w:w="2351"/>
             <w:shd w:val="clear" w:color="auto" w:fill="DCE6F1"/>
           </w:tcPr>
           <w:p>
@@ -3331,7 +3471,7 @@
         </w:tc>
         <w:tc>
           <w:tcPr>
-            <w:tcW w:type="dxa" w:w="3135"/>
+            <w:tcW w:type="dxa" w:w="2351"/>
             <w:shd w:val="clear" w:color="auto" w:fill="DCE6F1"/>
           </w:tcPr>
           <w:p>
@@ -3354,7 +3494,7 @@
         </w:tc>
         <w:tc>
           <w:tcPr>
-            <w:tcW w:type="dxa" w:w="3135"/>
+            <w:tcW w:type="dxa" w:w="2351"/>
             <w:shd w:val="clear" w:color="auto" w:fill="DCE6F1"/>
           </w:tcPr>
           <w:p>
@@ -3379,7 +3519,25 @@
       <w:tr>
         <w:tc>
           <w:tcPr>
-            <w:tcW w:type="dxa" w:w="3135"/>
+            <w:tcW w:type="dxa" w:w="2351"/>
+          </w:tcPr>
+          <w:p>
+            <w:r>
+              <w:rPr>
+                <w:sz w:val="18"/>
+              </w:rPr>
+            </w:r>
+            <w:r>
+              <w:rPr>
+                <w:sz w:val="18"/>
+              </w:rPr>
+              <w:t>MiniBatch K-Means</w:t>
+            </w:r>
+          </w:p>
+        </w:tc>
+        <w:tc>
+          <w:tcPr>
+            <w:tcW w:type="dxa" w:w="2351"/>
           </w:tcPr>
           <w:p>
             <w:r>
@@ -3397,7 +3555,7 @@
         </w:tc>
         <w:tc>
           <w:tcPr>
-            <w:tcW w:type="dxa" w:w="3135"/>
+            <w:tcW w:type="dxa" w:w="2351"/>
           </w:tcPr>
           <w:p>
             <w:r>
@@ -3409,13 +3567,13 @@
               <w:rPr>
                 <w:sz w:val="18"/>
               </w:rPr>
-              <w:t>0.334</w:t>
+              <w:t>0.280</w:t>
             </w:r>
           </w:p>
         </w:tc>
         <w:tc>
           <w:tcPr>
-            <w:tcW w:type="dxa" w:w="3135"/>
+            <w:tcW w:type="dxa" w:w="2351"/>
           </w:tcPr>
           <w:p>
             <w:r>
@@ -3427,7 +3585,7 @@
               <w:rPr>
                 <w:sz w:val="18"/>
               </w:rPr>
-              <w:t>0.171</w:t>
+              <w:t>0.124</w:t>
             </w:r>
           </w:p>
         </w:tc>
@@ -3435,7 +3593,25 @@
       <w:tr>
         <w:tc>
           <w:tcPr>
-            <w:tcW w:type="dxa" w:w="3135"/>
+            <w:tcW w:type="dxa" w:w="2351"/>
+          </w:tcPr>
+          <w:p>
+            <w:r>
+              <w:rPr>
+                <w:sz w:val="18"/>
+              </w:rPr>
+            </w:r>
+            <w:r>
+              <w:rPr>
+                <w:sz w:val="18"/>
+              </w:rPr>
+              <w:t>MiniBatch K-Means</w:t>
+            </w:r>
+          </w:p>
+        </w:tc>
+        <w:tc>
+          <w:tcPr>
+            <w:tcW w:type="dxa" w:w="2351"/>
           </w:tcPr>
           <w:p>
             <w:r>
@@ -3453,7 +3629,99 @@
         </w:tc>
         <w:tc>
           <w:tcPr>
-            <w:tcW w:type="dxa" w:w="3135"/>
+            <w:tcW w:type="dxa" w:w="2351"/>
+          </w:tcPr>
+          <w:p>
+            <w:r>
+              <w:rPr>
+                <w:sz w:val="18"/>
+              </w:rPr>
+            </w:r>
+            <w:r>
+              <w:rPr>
+                <w:sz w:val="18"/>
+              </w:rPr>
+              <w:t>0.345</w:t>
+            </w:r>
+          </w:p>
+        </w:tc>
+        <w:tc>
+          <w:tcPr>
+            <w:tcW w:type="dxa" w:w="2351"/>
+          </w:tcPr>
+          <w:p>
+            <w:r>
+              <w:rPr>
+                <w:sz w:val="18"/>
+              </w:rPr>
+            </w:r>
+            <w:r>
+              <w:rPr>
+                <w:sz w:val="18"/>
+              </w:rPr>
+              <w:t>0.338</w:t>
+            </w:r>
+          </w:p>
+        </w:tc>
+      </w:tr>
+      <w:tr>
+        <w:tc>
+          <w:tcPr>
+            <w:tcW w:type="dxa" w:w="2351"/>
+          </w:tcPr>
+          <w:p>
+            <w:r>
+              <w:rPr>
+                <w:sz w:val="18"/>
+              </w:rPr>
+            </w:r>
+            <w:r>
+              <w:rPr>
+                <w:sz w:val="18"/>
+              </w:rPr>
+              <w:t>MiniBatch K-Means</w:t>
+            </w:r>
+          </w:p>
+        </w:tc>
+        <w:tc>
+          <w:tcPr>
+            <w:tcW w:type="dxa" w:w="2351"/>
+          </w:tcPr>
+          <w:p>
+            <w:r>
+              <w:rPr>
+                <w:sz w:val="18"/>
+              </w:rPr>
+            </w:r>
+            <w:r>
+              <w:rPr>
+                <w:sz w:val="18"/>
+              </w:rPr>
+              <w:t>6</w:t>
+            </w:r>
+          </w:p>
+        </w:tc>
+        <w:tc>
+          <w:tcPr>
+            <w:tcW w:type="dxa" w:w="2351"/>
+          </w:tcPr>
+          <w:p>
+            <w:r>
+              <w:rPr>
+                <w:sz w:val="18"/>
+              </w:rPr>
+            </w:r>
+            <w:r>
+              <w:rPr>
+                <w:sz w:val="18"/>
+              </w:rPr>
+              <w:t>0.383</w:t>
+            </w:r>
+          </w:p>
+        </w:tc>
+        <w:tc>
+          <w:tcPr>
+            <w:tcW w:type="dxa" w:w="2351"/>
           </w:tcPr>
           <w:p>
             <w:r>
@@ -3466,13 +3734,15 @@
                 <w:b/>
                 <w:sz w:val="18"/>
               </w:rPr>
-              <w:t>0.468</w:t>
+              <w:t>0.497</w:t>
             </w:r>
           </w:p>
         </w:tc>
+      </w:tr>
+      <w:tr>
         <w:tc>
           <w:tcPr>
-            <w:tcW w:type="dxa" w:w="3135"/>
+            <w:tcW w:type="dxa" w:w="2351"/>
           </w:tcPr>
           <w:p>
             <w:r>
@@ -3484,15 +3754,13 @@
               <w:rPr>
                 <w:sz w:val="18"/>
               </w:rPr>
-              <w:t>0.401</w:t>
+              <w:t>MiniBatch K-Means</w:t>
             </w:r>
           </w:p>
         </w:tc>
-      </w:tr>
-      <w:tr>
         <w:tc>
           <w:tcPr>
-            <w:tcW w:type="dxa" w:w="3135"/>
+            <w:tcW w:type="dxa" w:w="2351"/>
           </w:tcPr>
           <w:p>
             <w:r>
@@ -3510,7 +3778,100 @@
         </w:tc>
         <w:tc>
           <w:tcPr>
-            <w:tcW w:type="dxa" w:w="3135"/>
+            <w:tcW w:type="dxa" w:w="2351"/>
+          </w:tcPr>
+          <w:p>
+            <w:r>
+              <w:rPr>
+                <w:sz w:val="18"/>
+              </w:rPr>
+            </w:r>
+            <w:r>
+              <w:rPr>
+                <w:sz w:val="18"/>
+              </w:rPr>
+              <w:t>0.407</w:t>
+            </w:r>
+          </w:p>
+        </w:tc>
+        <w:tc>
+          <w:tcPr>
+            <w:tcW w:type="dxa" w:w="2351"/>
+          </w:tcPr>
+          <w:p>
+            <w:r>
+              <w:rPr>
+                <w:sz w:val="18"/>
+              </w:rPr>
+            </w:r>
+            <w:r>
+              <w:rPr>
+                <w:sz w:val="18"/>
+              </w:rPr>
+              <w:t>0.447</w:t>
+            </w:r>
+          </w:p>
+        </w:tc>
+      </w:tr>
+      <w:tr>
+        <w:tc>
+          <w:tcPr>
+            <w:tcW w:type="dxa" w:w="2351"/>
+          </w:tcPr>
+          <w:p>
+            <w:r>
+              <w:rPr>
+                <w:sz w:val="18"/>
+              </w:rPr>
+            </w:r>
+            <w:r>
+              <w:rPr>
+                <w:sz w:val="18"/>
+              </w:rPr>
+              <w:t>MiniBatch K-Means</w:t>
+            </w:r>
+          </w:p>
+        </w:tc>
+        <w:tc>
+          <w:tcPr>
+            <w:tcW w:type="dxa" w:w="2351"/>
+          </w:tcPr>
+          <w:p>
+            <w:r>
+              <w:rPr>
+                <w:sz w:val="18"/>
+              </w:rPr>
+            </w:r>
+            <w:r>
+              <w:rPr>
+                <w:sz w:val="18"/>
+              </w:rPr>
+              <w:t>8</w:t>
+            </w:r>
+          </w:p>
+        </w:tc>
+        <w:tc>
+          <w:tcPr>
+            <w:tcW w:type="dxa" w:w="2351"/>
+          </w:tcPr>
+          <w:p>
+            <w:r>
+              <w:rPr>
+                <w:sz w:val="18"/>
+              </w:rPr>
+            </w:r>
+            <w:r>
+              <w:rPr>
+                <w:b/>
+                <w:sz w:val="18"/>
+              </w:rPr>
+              <w:t>0.438</w:t>
+            </w:r>
+          </w:p>
+        </w:tc>
+        <w:tc>
+          <w:tcPr>
+            <w:tcW w:type="dxa" w:w="2351"/>
           </w:tcPr>
           <w:p>
             <w:r>
@@ -3526,9 +3887,47 @@
             </w:r>
           </w:p>
         </w:tc>
+      </w:tr>
+      <w:tr>
         <w:tc>
           <w:tcPr>
-            <w:tcW w:type="dxa" w:w="3135"/>
+            <w:tcW w:type="dxa" w:w="2351"/>
+          </w:tcPr>
+          <w:p>
+            <w:r>
+              <w:rPr>
+                <w:sz w:val="18"/>
+              </w:rPr>
+            </w:r>
+            <w:r>
+              <w:rPr>
+                <w:sz w:val="18"/>
+              </w:rPr>
+              <w:t>iK-means</w:t>
+            </w:r>
+          </w:p>
+        </w:tc>
+        <w:tc>
+          <w:tcPr>
+            <w:tcW w:type="dxa" w:w="2351"/>
+          </w:tcPr>
+          <w:p>
+            <w:r>
+              <w:rPr>
+                <w:sz w:val="18"/>
+              </w:rPr>
+            </w:r>
+            <w:r>
+              <w:rPr>
+                <w:sz w:val="18"/>
+              </w:rPr>
+              <w:t>2 (Rob) / 6 (Std)</w:t>
+            </w:r>
+          </w:p>
+        </w:tc>
+        <w:tc>
+          <w:tcPr>
+            <w:tcW w:type="dxa" w:w="2351"/>
           </w:tcPr>
           <w:p>
             <w:r>
@@ -3541,7 +3940,26 @@
                 <w:b/>
                 <w:sz w:val="18"/>
               </w:rPr>
-              <w:t>0.436</w:t>
+              <w:t>1.000</w:t>
+            </w:r>
+          </w:p>
+        </w:tc>
+        <w:tc>
+          <w:tcPr>
+            <w:tcW w:type="dxa" w:w="2351"/>
+          </w:tcPr>
+          <w:p>
+            <w:r>
+              <w:rPr>
+                <w:sz w:val="18"/>
+              </w:rPr>
+            </w:r>
+            <w:r>
+              <w:rPr>
+                <w:b/>
+                <w:sz w:val="18"/>
+              </w:rPr>
+              <w:t>1.000</w:t>
             </w:r>
           </w:p>
         </w:tc>
@@ -3550,7 +3968,7 @@
     <w:p/>
     <w:p>
       <w:r>
-        <w:t>No K reaches the 0.80 threshold yet — the partition is silhouette-informative but seed-fragile. This is the central robustness question that motivates the planned variants below.</w:t>
+        <w:t>MiniBatch K-Means is silhouette-informative at K = 2 but seed-fragile: no MiniBatch K reaches the 0.80 threshold under either scaler. iK-means, by contrast, hits perfect stability under both scalers (K = 6 standard and K = 2 robust), which is what makes iK-means-Robust K = 2 the strongest baseline candidate.</w:t>
       </w:r>
     </w:p>
     <w:p>
@@ -3563,17 +3981,7 @@
     </w:p>
     <w:p>
       <w:r>
-        <w:t xml:space="preserve">Three comparisons, anchored against </w:t>
-      </w:r>
-      <w:r>
-        <w:rPr>
-          <w:rFonts w:ascii="Consolas" w:hAnsi="Consolas"/>
-          <w:sz w:val="18"/>
-        </w:rPr>
-        <w:t>repA</w:t>
-      </w:r>
-      <w:r>
-        <w:t>-StandardScaler:</w:t>
+        <w:t>Two comparisons, anchored against the canonical representation under StandardScaler:</w:t>
       </w:r>
     </w:p>
     <w:p>
@@ -3582,23 +3990,12 @@
       </w:pPr>
       <w:r>
         <w:rPr>
-          <w:rFonts w:ascii="Consolas" w:hAnsi="Consolas"/>
-          <w:sz w:val="18"/>
+          <w:b/>
         </w:rPr>
-        <w:t>repA</w:t>
-      </w:r>
-      <w:r>
-        <w:t xml:space="preserve">-standard vs </w:t>
-      </w:r>
-      <w:r>
-        <w:rPr>
-          <w:rFonts w:ascii="Consolas" w:hAnsi="Consolas"/>
-          <w:sz w:val="18"/>
-        </w:rPr>
-        <w:t>repA</w:t>
-      </w:r>
-      <w:r>
-        <w:t>-robust — already running in the same pipeline; the table above quantifies it. Does the silhouette-best K and its stability survive a scaler swap from Standard to Robust?</w:t>
+        <w:t>Standard vs Robust scaler</w:t>
+      </w:r>
+      <w:r>
+        <w:t xml:space="preserve"> — already running in the same pipeline; the table above quantifies it. Does the silhouette-best K and its stability survive a scaler swap from Standard to Robust? At this checkpoint Robust strengthens both the K = 2 silhouette gap (0.1585 vs 0.1035) and the K = 6 ARI (0.497 vs 0.383); the iK-means K choice flips from 6 to 2.</w:t>
       </w:r>
     </w:p>
     <w:p>
@@ -3607,98 +4004,12 @@
       </w:pPr>
       <w:r>
         <w:rPr>
-          <w:rFonts w:ascii="Consolas" w:hAnsi="Consolas"/>
-          <w:sz w:val="18"/>
+          <w:b/>
         </w:rPr>
-        <w:t>repA</w:t>
-      </w:r>
-      <w:r>
-        <w:t xml:space="preserve"> vs an engineered representation </w:t>
-      </w:r>
-      <w:r>
-        <w:rPr>
-          <w:rFonts w:ascii="Consolas" w:hAnsi="Consolas"/>
-          <w:sz w:val="18"/>
-        </w:rPr>
-        <w:t>repB</w:t>
-      </w:r>
-      <w:r>
-        <w:t xml:space="preserve"> (in </w:t>
-      </w:r>
-      <w:r>
-        <w:rPr>
-          <w:rFonts w:ascii="Consolas" w:hAnsi="Consolas"/>
-          <w:sz w:val="18"/>
-        </w:rPr>
-        <w:t>pipeline_v2.py</w:t>
-      </w:r>
-      <w:r>
-        <w:t xml:space="preserve">: </w:t>
-      </w:r>
-      <w:r>
-        <w:rPr>
-          <w:rFonts w:ascii="Consolas" w:hAnsi="Consolas"/>
-          <w:sz w:val="18"/>
-        </w:rPr>
-        <w:t>total_nights</w:t>
-      </w:r>
-      <w:r>
-        <w:t xml:space="preserve">, </w:t>
-      </w:r>
-      <w:r>
-        <w:rPr>
-          <w:rFonts w:ascii="Consolas" w:hAnsi="Consolas"/>
-          <w:sz w:val="18"/>
-        </w:rPr>
-        <w:t>party_size</w:t>
-      </w:r>
-      <w:r>
-        <w:t xml:space="preserve">, </w:t>
-      </w:r>
-      <w:r>
-        <w:rPr>
-          <w:rFonts w:ascii="Consolas" w:hAnsi="Consolas"/>
-          <w:sz w:val="18"/>
-        </w:rPr>
-        <w:t>has_kids</w:t>
-      </w:r>
-      <w:r>
-        <w:t xml:space="preserve">, </w:t>
-      </w:r>
-      <w:r>
-        <w:rPr>
-          <w:rFonts w:ascii="Consolas" w:hAnsi="Consolas"/>
-          <w:sz w:val="18"/>
-        </w:rPr>
-        <w:t>weekend_share</w:t>
-      </w:r>
-      <w:r>
-        <w:t xml:space="preserve">, plus </w:t>
-      </w:r>
-      <w:r>
-        <w:rPr>
-          <w:rFonts w:ascii="Consolas" w:hAnsi="Consolas"/>
-          <w:sz w:val="18"/>
-        </w:rPr>
-        <w:t>VarianceThreshold</w:t>
-      </w:r>
-      <w:r>
-        <w:t xml:space="preserve"> on rare dummies and block-equalised numerical-vs-categorical contribution). Does the K = 2 silhouette dominance survive feature engineering that re-balances the implicit Euclidean metric?</w:t>
-      </w:r>
-    </w:p>
-    <w:p>
-      <w:pPr>
-        <w:pStyle w:val="ListNumber"/>
-      </w:pPr>
-      <w:r>
-        <w:rPr>
-          <w:rFonts w:ascii="Consolas" w:hAnsi="Consolas"/>
-          <w:sz w:val="18"/>
-        </w:rPr>
-        <w:t>repA</w:t>
-      </w:r>
-      <w:r>
-        <w:t xml:space="preserve"> with vs without PCA-20. Does compressing the 53-dim space to 20 PCs change which K is silhouette-best? Particularly relevant for iK-means, whose discovery phase already runs in PCA space.</w:t>
+        <w:t>With vs without PCA-20</w:t>
+      </w:r>
+      <w:r>
+        <w:t xml:space="preserve"> — does compressing the 49-dim space to 20 PCs change which K is silhouette-best? Particularly relevant for iK-means, whose discovery phase already runs in PCA space, so a controlled PCA pre-step lets us check whether iK-means' K choice is driven by the discovery dimensionality or by the data geometry itself.</w:t>
       </w:r>
     </w:p>
     <w:p>
@@ -3709,7 +4020,7 @@
         <w:t>Acceptance bar.</w:t>
       </w:r>
       <w:r>
-        <w:t xml:space="preserve"> A partition is considered "robust" only if it (i) maximises silhouette in at least 3 of the 4 variants and (ii) reaches mean ARI of at least 0.80 in at least one variant.</w:t>
+        <w:t xml:space="preserve"> A partition is considered "robust" only if it (i) maximises silhouette in at least 2 of the 3 variants (canonical-Standard, canonical-Robust, canonical-PCA20) and (ii) reaches mean ARI of at least 0.80 in at least one variant. iK-means already meets the ARI condition under both scalers; the open question is whether it survives the PCA-20 perturbation.</w:t>
       </w:r>
     </w:p>
     <w:p>
@@ -3738,7 +4049,7 @@
         <w:t>src/utils/experiment_logger.py</w:t>
       </w:r>
       <w:r>
-        <w:t xml:space="preserve"> (300 rows after the latest run). Schema: </w:t>
+        <w:t xml:space="preserve"> (160 rows after the latest committed run: 7 K × 2 scalers × 10 seeds for MiniBatch K-Means, plus 2 scalers × 10 seeds for iK-means). Schema: </w:t>
       </w:r>
       <w:r>
         <w:rPr>
@@ -3758,17 +4069,7 @@
         <w:t>date / run_id</w:t>
       </w:r>
       <w:r>
-        <w:t xml:space="preserve"> pair, an explicit </w:t>
-      </w:r>
-      <w:r>
-        <w:rPr>
-          <w:rFonts w:ascii="Consolas" w:hAnsi="Consolas"/>
-          <w:sz w:val="18"/>
-        </w:rPr>
-        <w:t>representation_id</w:t>
-      </w:r>
-      <w:r>
-        <w:t xml:space="preserve"> column, a </w:t>
+        <w:t xml:space="preserve"> pair, a </w:t>
       </w:r>
       <w:r>
         <w:rPr>
@@ -3850,16 +4151,7 @@
         <w:t>`run_all`</w:t>
       </w:r>
       <w:r>
-        <w:t xml:space="preserve"> (bash) and </w:t>
-      </w:r>
-      <w:r>
-        <w:rPr>
-          <w:b/>
-        </w:rPr>
-        <w:t>`run_all.ps1`</w:t>
-      </w:r>
-      <w:r>
-        <w:t xml:space="preserve"> (PowerShell wrapper for native Windows) execute the Task 1 pipeline end-to-end: SHA-256 validation, preprocessing, baseline clustering with k-means and iK-means under both scalers. Every figure in </w:t>
+        <w:t xml:space="preserve"> (bash) executes the Task 1 pipeline end-to-end: SHA-256 validation, preprocessing, baseline clustering with k-means and iK-means under both scalers. Every figure in </w:t>
       </w:r>
       <w:r>
         <w:rPr>

</xml_diff>